<commit_message>
Keep Exp tenant selection off client query params and refresh the Kenya guide.
Ignore any client-supplied database or supplier, strip them from next URLs, remove the secret from the client Word guide, and drop unused-parameter lists.

Co-authored-by: soniarun532-rgb <soniarun532-rgb@users.noreply.github.com>
</commit_message>
<xml_diff>
--- a/docs/SAT-Datashare-Client-Test-Guide-Kenya.docx
+++ b/docs/SAT-Datashare-Client-Test-Guide-Kenya.docx
@@ -490,7 +490,7 @@
           <w:color w:val="2D2D2D"/>
           <w:sz w:val="22"/>
         </w:rPr>
-        <w:t>This document is a template. Replace the three placeholders below with the values issued to you. Do not commit secrets into email threads or shared drives.</w:t>
+        <w:t>This document is a template. Replace the placeholders below with the values issued to you. The client secret is not included here. It will be sent separately.</w:t>
       </w:r>
     </w:p>
     <w:tbl>
@@ -701,7 +701,7 @@
                 <w:color w:val="2D2D2D"/>
                 <w:sz w:val="18"/>
               </w:rPr>
-              <w:t>&lt;YOUR_KENYA_CLIENT_SECRET&gt;</w:t>
+              <w:t>&lt;ACCESS_TOKEN&gt;</w:t>
             </w:r>
           </w:p>
         </w:tc>
@@ -729,7 +729,7 @@
                 <w:color w:val="2D2D2D"/>
                 <w:sz w:val="19"/>
               </w:rPr>
-              <w:t>Token request — client_secret</w:t>
+              <w:t>Every GET — Authorization header</w:t>
             </w:r>
           </w:p>
         </w:tc>
@@ -737,92 +737,6 @@
           <w:tcPr>
             <w:tcW w:type="dxa" w:w="3118"/>
             <w:shd w:fill="E9F0F7" w:val="clear"/>
-            <w:tcBorders>
-              <w:top w:val="single" w:sz="4" w:space="0" w:color="BFBFBF"/>
-              <w:left w:val="single" w:sz="4" w:space="0" w:color="BFBFBF"/>
-              <w:bottom w:val="single" w:sz="4" w:space="0" w:color="BFBFBF"/>
-              <w:right w:val="single" w:sz="4" w:space="0" w:color="BFBFBF"/>
-            </w:tcBorders>
-          </w:tcPr>
-          <w:p>
-            <w:pPr>
-              <w:spacing w:before="40" w:after="40"/>
-            </w:pPr>
-            <w:r/>
-            <w:r>
-              <w:rPr>
-                <w:rFonts w:ascii="Calibri" w:hAnsi="Calibri" w:cs="Calibri"/>
-                <w:b w:val="0"/>
-                <w:i w:val="0"/>
-                <w:color w:val="2D2D2D"/>
-                <w:sz w:val="19"/>
-              </w:rPr>
-              <w:t>Kenya OAuth client secret</w:t>
-            </w:r>
-          </w:p>
-        </w:tc>
-      </w:tr>
-      <w:tr>
-        <w:tc>
-          <w:tcPr>
-            <w:tcW w:type="dxa" w:w="3515"/>
-            <w:shd w:fill="FFFFFF" w:val="clear"/>
-            <w:tcBorders>
-              <w:top w:val="single" w:sz="4" w:space="0" w:color="BFBFBF"/>
-              <w:left w:val="single" w:sz="4" w:space="0" w:color="BFBFBF"/>
-              <w:bottom w:val="single" w:sz="4" w:space="0" w:color="BFBFBF"/>
-              <w:right w:val="single" w:sz="4" w:space="0" w:color="BFBFBF"/>
-            </w:tcBorders>
-          </w:tcPr>
-          <w:p>
-            <w:pPr>
-              <w:spacing w:before="40" w:after="40"/>
-            </w:pPr>
-            <w:r/>
-            <w:r>
-              <w:rPr>
-                <w:rFonts w:ascii="Consolas" w:hAnsi="Consolas" w:cs="Consolas"/>
-                <w:b w:val="0"/>
-                <w:i w:val="0"/>
-                <w:color w:val="2D2D2D"/>
-                <w:sz w:val="18"/>
-              </w:rPr>
-              <w:t>&lt;ACCESS_TOKEN&gt;</w:t>
-            </w:r>
-          </w:p>
-        </w:tc>
-        <w:tc>
-          <w:tcPr>
-            <w:tcW w:type="dxa" w:w="3288"/>
-            <w:shd w:fill="FFFFFF" w:val="clear"/>
-            <w:tcBorders>
-              <w:top w:val="single" w:sz="4" w:space="0" w:color="BFBFBF"/>
-              <w:left w:val="single" w:sz="4" w:space="0" w:color="BFBFBF"/>
-              <w:bottom w:val="single" w:sz="4" w:space="0" w:color="BFBFBF"/>
-              <w:right w:val="single" w:sz="4" w:space="0" w:color="BFBFBF"/>
-            </w:tcBorders>
-          </w:tcPr>
-          <w:p>
-            <w:pPr>
-              <w:spacing w:before="40" w:after="40"/>
-            </w:pPr>
-            <w:r/>
-            <w:r>
-              <w:rPr>
-                <w:rFonts w:ascii="Calibri" w:hAnsi="Calibri" w:cs="Calibri"/>
-                <w:b w:val="0"/>
-                <w:i w:val="0"/>
-                <w:color w:val="2D2D2D"/>
-                <w:sz w:val="19"/>
-              </w:rPr>
-              <w:t>Every GET — Authorization header</w:t>
-            </w:r>
-          </w:p>
-        </w:tc>
-        <w:tc>
-          <w:tcPr>
-            <w:tcW w:type="dxa" w:w="3118"/>
-            <w:shd w:fill="FFFFFF" w:val="clear"/>
             <w:tcBorders>
               <w:top w:val="single" w:sz="4" w:space="0" w:color="BFBFBF"/>
               <w:left w:val="single" w:sz="4" w:space="0" w:color="BFBFBF"/>
@@ -881,7 +795,7 @@
           <w:color w:val="2D2D2D"/>
           <w:sz w:val="22"/>
         </w:rPr>
-        <w:t>Kenya Reckitt data is served from database sat_nobleoutlook and supplier RECKITT BENCKISER. The API selects this tenant from your Kenya OAuth client. Do not send database or supplier on any request.</w:t>
+        <w:t>Kenya Reckitt data is selected from your Kenya OAuth client (sat_nobleoutlook / RECKITT BENCKISER).</w:t>
       </w:r>
     </w:p>
     <w:p>
@@ -911,7 +825,7 @@
           <w:color w:val="2D2D2D"/>
           <w:sz w:val="22"/>
         </w:rPr>
-        <w:t>Call Azure AD with grant_type=client_credentials. Copy access_token from the JSON response. Tokens expire (typically about 60 minutes). Request a new token when calls return HTTP 401.</w:t>
+        <w:t>Call Azure AD with grant_type=client_credentials. Copy access_token from the JSON response. Tokens expire (typically about 60 minutes). Request a new token when calls return HTTP 401. The client secret will be sent separately. Add it to this token request when you receive it.</w:t>
       </w:r>
     </w:p>
     <w:p>
@@ -971,8 +885,6 @@
               <w:br/>
               <w:t xml:space="preserve">  --data-urlencode 'client_id=&lt;YOUR_KENYA_CLIENT_ID&gt;' \</w:t>
               <w:br/>
-              <w:t xml:space="preserve">  --data-urlencode 'client_secret=&lt;YOUR_KENYA_CLIENT_SECRET&gt;' \</w:t>
-              <w:br/>
               <w:t xml:space="preserve">  --data-urlencode 'scope=https://graph.microsoft.com/.default'</w:t>
             </w:r>
           </w:p>
@@ -983,6 +895,21 @@
       <w:pPr>
         <w:spacing w:after="120"/>
       </w:pPr>
+    </w:p>
+    <w:p>
+      <w:pPr>
+        <w:spacing w:before="0" w:after="160" w:line="276" w:lineRule="auto"/>
+      </w:pPr>
+      <w:r>
+        <w:rPr>
+          <w:rFonts w:ascii="Calibri" w:hAnsi="Calibri" w:cs="Calibri"/>
+          <w:b w:val="0"/>
+          <w:i w:val="0"/>
+          <w:color w:val="1F4E79"/>
+          <w:sz w:val="21"/>
+        </w:rPr>
+        <w:t>Note: the client secret is not shown in this guide. It will be sent separately. When you have it, include it on the token request as the client_secret form field.</w:t>
+      </w:r>
     </w:p>
     <w:p>
       <w:pPr>
@@ -1293,7 +1220,7 @@
                 <w:color w:val="2D2D2D"/>
                 <w:sz w:val="19"/>
               </w:rPr>
-              <w:t>client_secret</w:t>
+              <w:t>scope</w:t>
             </w:r>
           </w:p>
         </w:tc>
@@ -1329,92 +1256,6 @@
           <w:tcPr>
             <w:tcW w:type="dxa" w:w="5669"/>
             <w:shd w:fill="FFFFFF" w:val="clear"/>
-            <w:tcBorders>
-              <w:top w:val="single" w:sz="4" w:space="0" w:color="BFBFBF"/>
-              <w:left w:val="single" w:sz="4" w:space="0" w:color="BFBFBF"/>
-              <w:bottom w:val="single" w:sz="4" w:space="0" w:color="BFBFBF"/>
-              <w:right w:val="single" w:sz="4" w:space="0" w:color="BFBFBF"/>
-            </w:tcBorders>
-          </w:tcPr>
-          <w:p>
-            <w:pPr>
-              <w:spacing w:before="40" w:after="40"/>
-            </w:pPr>
-            <w:r/>
-            <w:r>
-              <w:rPr>
-                <w:rFonts w:ascii="Consolas" w:hAnsi="Consolas" w:cs="Consolas"/>
-                <w:b w:val="0"/>
-                <w:i w:val="0"/>
-                <w:color w:val="2D2D2D"/>
-                <w:sz w:val="18"/>
-              </w:rPr>
-              <w:t>&lt;YOUR_KENYA_CLIENT_SECRET&gt;</w:t>
-            </w:r>
-          </w:p>
-        </w:tc>
-      </w:tr>
-      <w:tr>
-        <w:tc>
-          <w:tcPr>
-            <w:tcW w:type="dxa" w:w="2551"/>
-            <w:shd w:fill="E9F0F7" w:val="clear"/>
-            <w:tcBorders>
-              <w:top w:val="single" w:sz="4" w:space="0" w:color="BFBFBF"/>
-              <w:left w:val="single" w:sz="4" w:space="0" w:color="BFBFBF"/>
-              <w:bottom w:val="single" w:sz="4" w:space="0" w:color="BFBFBF"/>
-              <w:right w:val="single" w:sz="4" w:space="0" w:color="BFBFBF"/>
-            </w:tcBorders>
-          </w:tcPr>
-          <w:p>
-            <w:pPr>
-              <w:spacing w:before="40" w:after="40"/>
-            </w:pPr>
-            <w:r/>
-            <w:r>
-              <w:rPr>
-                <w:rFonts w:ascii="Consolas" w:hAnsi="Consolas" w:cs="Consolas"/>
-                <w:b w:val="0"/>
-                <w:i w:val="0"/>
-                <w:color w:val="2D2D2D"/>
-                <w:sz w:val="19"/>
-              </w:rPr>
-              <w:t>scope</w:t>
-            </w:r>
-          </w:p>
-        </w:tc>
-        <w:tc>
-          <w:tcPr>
-            <w:tcW w:type="dxa" w:w="1701"/>
-            <w:shd w:fill="E9F0F7" w:val="clear"/>
-            <w:tcBorders>
-              <w:top w:val="single" w:sz="4" w:space="0" w:color="BFBFBF"/>
-              <w:left w:val="single" w:sz="4" w:space="0" w:color="BFBFBF"/>
-              <w:bottom w:val="single" w:sz="4" w:space="0" w:color="BFBFBF"/>
-              <w:right w:val="single" w:sz="4" w:space="0" w:color="BFBFBF"/>
-            </w:tcBorders>
-          </w:tcPr>
-          <w:p>
-            <w:pPr>
-              <w:spacing w:before="40" w:after="40"/>
-            </w:pPr>
-            <w:r/>
-            <w:r>
-              <w:rPr>
-                <w:rFonts w:ascii="Calibri" w:hAnsi="Calibri" w:cs="Calibri"/>
-                <w:b w:val="0"/>
-                <w:i w:val="0"/>
-                <w:color w:val="2D2D2D"/>
-                <w:sz w:val="19"/>
-              </w:rPr>
-              <w:t>Yes</w:t>
-            </w:r>
-          </w:p>
-        </w:tc>
-        <w:tc>
-          <w:tcPr>
-            <w:tcW w:type="dxa" w:w="5669"/>
-            <w:shd w:fill="E9F0F7" w:val="clear"/>
             <w:tcBorders>
               <w:top w:val="single" w:sz="4" w:space="0" w:color="BFBFBF"/>
               <w:left w:val="single" w:sz="4" w:space="0" w:color="BFBFBF"/>
@@ -1561,22 +1402,6 @@
           <w:sz w:val="22"/>
         </w:rPr>
         <w:t>•  Authorization: Bearer &lt;ACCESS_TOKEN&gt;</w:t>
-      </w:r>
-    </w:p>
-    <w:p>
-      <w:pPr>
-        <w:spacing w:after="60"/>
-        <w:ind w:left="227"/>
-      </w:pPr>
-      <w:r>
-        <w:rPr>
-          <w:rFonts w:ascii="Calibri" w:hAnsi="Calibri" w:cs="Calibri"/>
-          <w:b w:val="0"/>
-          <w:i w:val="0"/>
-          <w:color w:val="2D2D2D"/>
-          <w:sz w:val="22"/>
-        </w:rPr>
-        <w:t>•  Do not send database, supplier, client_id, or client_secret on the GET.</w:t>
       </w:r>
     </w:p>
     <w:p>
@@ -5479,37 +5304,7 @@
           <w:color w:val="5B6570"/>
           <w:sz w:val="21"/>
         </w:rPr>
-        <w:t>No query parameters. Do not send fromDate or toDate.</w:t>
-      </w:r>
-    </w:p>
-    <w:p>
-      <w:pPr>
-        <w:spacing w:before="0" w:after="80" w:line="276" w:lineRule="auto"/>
-      </w:pPr>
-      <w:r>
-        <w:rPr>
-          <w:rFonts w:ascii="Calibri" w:hAnsi="Calibri" w:cs="Calibri"/>
-          <w:b/>
-          <w:i w:val="0"/>
-          <w:color w:val="1F4E79"/>
-          <w:sz w:val="22"/>
-        </w:rPr>
-        <w:t>Query parameters</w:t>
-      </w:r>
-    </w:p>
-    <w:p>
-      <w:pPr>
-        <w:spacing w:before="0" w:after="120" w:line="276" w:lineRule="auto"/>
-      </w:pPr>
-      <w:r>
-        <w:rPr>
-          <w:rFonts w:ascii="Calibri" w:hAnsi="Calibri" w:cs="Calibri"/>
-          <w:b w:val="0"/>
-          <w:i w:val="0"/>
-          <w:color w:val="2D2D2D"/>
-          <w:sz w:val="21"/>
-        </w:rPr>
-        <w:t>None. Do not add fromDate, toDate, database, or supplier.</w:t>
+        <w:t>Returns the product catalogue.</w:t>
       </w:r>
     </w:p>
     <w:p>
@@ -5924,37 +5719,7 @@
           <w:color w:val="5B6570"/>
           <w:sz w:val="21"/>
         </w:rPr>
-        <w:t>No query parameters. Do not send fromDate or toDate.</w:t>
-      </w:r>
-    </w:p>
-    <w:p>
-      <w:pPr>
-        <w:spacing w:before="0" w:after="80" w:line="276" w:lineRule="auto"/>
-      </w:pPr>
-      <w:r>
-        <w:rPr>
-          <w:rFonts w:ascii="Calibri" w:hAnsi="Calibri" w:cs="Calibri"/>
-          <w:b/>
-          <w:i w:val="0"/>
-          <w:color w:val="1F4E79"/>
-          <w:sz w:val="22"/>
-        </w:rPr>
-        <w:t>Query parameters</w:t>
-      </w:r>
-    </w:p>
-    <w:p>
-      <w:pPr>
-        <w:spacing w:before="0" w:after="120" w:line="276" w:lineRule="auto"/>
-      </w:pPr>
-      <w:r>
-        <w:rPr>
-          <w:rFonts w:ascii="Calibri" w:hAnsi="Calibri" w:cs="Calibri"/>
-          <w:b w:val="0"/>
-          <w:i w:val="0"/>
-          <w:color w:val="2D2D2D"/>
-          <w:sz w:val="21"/>
-        </w:rPr>
-        <w:t>None. Do not add fromDate, toDate, database, or supplier.</w:t>
+        <w:t>Returns sales routes.</w:t>
       </w:r>
     </w:p>
     <w:p>
@@ -6375,37 +6140,7 @@
           <w:color w:val="5B6570"/>
           <w:sz w:val="21"/>
         </w:rPr>
-        <w:t>No query parameters. Do not send fromDate or toDate.</w:t>
-      </w:r>
-    </w:p>
-    <w:p>
-      <w:pPr>
-        <w:spacing w:before="0" w:after="80" w:line="276" w:lineRule="auto"/>
-      </w:pPr>
-      <w:r>
-        <w:rPr>
-          <w:rFonts w:ascii="Calibri" w:hAnsi="Calibri" w:cs="Calibri"/>
-          <w:b/>
-          <w:i w:val="0"/>
-          <w:color w:val="1F4E79"/>
-          <w:sz w:val="22"/>
-        </w:rPr>
-        <w:t>Query parameters</w:t>
-      </w:r>
-    </w:p>
-    <w:p>
-      <w:pPr>
-        <w:spacing w:before="0" w:after="120" w:line="276" w:lineRule="auto"/>
-      </w:pPr>
-      <w:r>
-        <w:rPr>
-          <w:rFonts w:ascii="Calibri" w:hAnsi="Calibri" w:cs="Calibri"/>
-          <w:b w:val="0"/>
-          <w:i w:val="0"/>
-          <w:color w:val="2D2D2D"/>
-          <w:sz w:val="21"/>
-        </w:rPr>
-        <w:t>None. Do not add fromDate, toDate, database, or supplier.</w:t>
+        <w:t>Returns sales representatives.</w:t>
       </w:r>
     </w:p>
     <w:p>
@@ -7863,7 +7598,7 @@
           <w:color w:val="5B6570"/>
           <w:sz w:val="21"/>
         </w:rPr>
-        <w:t>Only pageNumber is accepted. Do not send fromDate or toDate.</w:t>
+        <w:t>Returns inventory by warehouse.</w:t>
       </w:r>
     </w:p>
     <w:p>
@@ -8602,37 +8337,7 @@
           <w:color w:val="5B6570"/>
           <w:sz w:val="21"/>
         </w:rPr>
-        <w:t>No query parameters. Do not send fromDate or toDate.</w:t>
-      </w:r>
-    </w:p>
-    <w:p>
-      <w:pPr>
-        <w:spacing w:before="0" w:after="80" w:line="276" w:lineRule="auto"/>
-      </w:pPr>
-      <w:r>
-        <w:rPr>
-          <w:rFonts w:ascii="Calibri" w:hAnsi="Calibri" w:cs="Calibri"/>
-          <w:b/>
-          <w:i w:val="0"/>
-          <w:color w:val="1F4E79"/>
-          <w:sz w:val="22"/>
-        </w:rPr>
-        <w:t>Query parameters</w:t>
-      </w:r>
-    </w:p>
-    <w:p>
-      <w:pPr>
-        <w:spacing w:before="0" w:after="120" w:line="276" w:lineRule="auto"/>
-      </w:pPr>
-      <w:r>
-        <w:rPr>
-          <w:rFonts w:ascii="Calibri" w:hAnsi="Calibri" w:cs="Calibri"/>
-          <w:b w:val="0"/>
-          <w:i w:val="0"/>
-          <w:color w:val="2D2D2D"/>
-          <w:sz w:val="21"/>
-        </w:rPr>
-        <w:t>None. Do not add fromDate, toDate, database, or supplier.</w:t>
+        <w:t>Returns warehouses.</w:t>
       </w:r>
     </w:p>
     <w:p>
@@ -9133,7 +8838,7 @@
         <w:color w:val="5B6570"/>
         <w:sz w:val="17"/>
       </w:rPr>
-      <w:t xml:space="preserve">Confidential  ·  For the client test team  ·  Replace placeholder credentials before use  ·  Page </w:t>
+      <w:t xml:space="preserve">Confidential  ·  For the client test team  ·  Client secret sent separately  ·  Page </w:t>
     </w:r>
     <w:r>
       <w:rPr>

</xml_diff>

<commit_message>
Polish the Kenya client guide: troubleshooting, page-locked code, overview.
Move 401 out of Expected results, stop code tables splitting across pages, rename section 1, and restore Database and Supplier as derived environment values.

Co-authored-by: soniarun532-rgb <soniarun532-rgb@users.noreply.github.com>
</commit_message>
<xml_diff>
--- a/docs/SAT-Datashare-Client-Test-Guide-Kenya.docx
+++ b/docs/SAT-Datashare-Client-Test-Guide-Kenya.docx
@@ -4,6 +4,8 @@
   <w:body>
     <w:p>
       <w:pPr>
+        <w:keepNext w:val="0"/>
+        <w:keepLines/>
         <w:spacing w:before="0" w:after="40" w:line="276" w:lineRule="auto"/>
       </w:pPr>
       <w:r>
@@ -19,6 +21,8 @@
     </w:p>
     <w:p>
       <w:pPr>
+        <w:keepNext w:val="0"/>
+        <w:keepLines/>
         <w:spacing w:before="0" w:after="40" w:line="276" w:lineRule="auto"/>
       </w:pPr>
       <w:r>
@@ -34,6 +38,8 @@
     </w:p>
     <w:p>
       <w:pPr>
+        <w:keepNext w:val="0"/>
+        <w:keepLines/>
         <w:spacing w:before="0" w:after="160" w:line="276" w:lineRule="auto"/>
       </w:pPr>
       <w:r>
@@ -44,11 +50,13 @@
           <w:color w:val="5B6570"/>
           <w:sz w:val="24"/>
         </w:rPr>
-        <w:t>v1.0 – 25 September 2026   ·   Kenya   ·   exp-sat-datashare-prod-api</w:t>
+        <w:t>v1.1 – 25 September 2026   ·   Kenya   ·   exp-sat-datashare-prod-api</w:t>
       </w:r>
     </w:p>
     <w:p>
       <w:pPr>
+        <w:keepNext w:val="0"/>
+        <w:keepLines/>
         <w:spacing w:before="0" w:after="200" w:line="276" w:lineRule="auto"/>
       </w:pPr>
       <w:r>
@@ -73,6 +81,9 @@
         <w:gridCol w:w="9866"/>
       </w:tblGrid>
       <w:tr>
+        <w:trPr>
+          <w:cantSplit/>
+        </w:trPr>
         <w:tc>
           <w:tcPr>
             <w:tcW w:type="dxa" w:w="9866"/>
@@ -120,11 +131,13 @@
           <w:color w:val="1F4E79"/>
           <w:sz w:val="32"/>
         </w:rPr>
-        <w:t>1. OAuth credentials</w:t>
+        <w:t>1. Overview and credentials</w:t>
       </w:r>
     </w:p>
     <w:p>
       <w:pPr>
+        <w:keepNext w:val="0"/>
+        <w:keepLines/>
         <w:spacing w:before="0" w:after="160" w:line="276" w:lineRule="auto"/>
       </w:pPr>
       <w:r>
@@ -150,6 +163,9 @@
         <w:gridCol w:w="6917"/>
       </w:tblGrid>
       <w:tr>
+        <w:trPr>
+          <w:cantSplit/>
+        </w:trPr>
         <w:tc>
           <w:tcPr>
             <w:tcW w:type="dxa" w:w="2948"/>
@@ -207,6 +223,9 @@
         </w:tc>
       </w:tr>
       <w:tr>
+        <w:trPr>
+          <w:cantSplit/>
+        </w:trPr>
         <w:tc>
           <w:tcPr>
             <w:tcW w:type="dxa" w:w="2948"/>
@@ -264,6 +283,9 @@
         </w:tc>
       </w:tr>
       <w:tr>
+        <w:trPr>
+          <w:cantSplit/>
+        </w:trPr>
         <w:tc>
           <w:tcPr>
             <w:tcW w:type="dxa" w:w="2948"/>
@@ -321,6 +343,129 @@
         </w:tc>
       </w:tr>
       <w:tr>
+        <w:trPr>
+          <w:cantSplit/>
+        </w:trPr>
+        <w:tc>
+          <w:tcPr>
+            <w:tcW w:type="dxa" w:w="2948"/>
+            <w:shd w:fill="E9F0F7" w:val="clear"/>
+            <w:tcBorders>
+              <w:top w:val="single" w:sz="4" w:space="0" w:color="BFBFBF"/>
+              <w:left w:val="single" w:sz="4" w:space="0" w:color="BFBFBF"/>
+              <w:bottom w:val="single" w:sz="4" w:space="0" w:color="BFBFBF"/>
+              <w:right w:val="single" w:sz="4" w:space="0" w:color="BFBFBF"/>
+            </w:tcBorders>
+          </w:tcPr>
+          <w:p>
+            <w:pPr>
+              <w:spacing w:before="40" w:after="40"/>
+            </w:pPr>
+            <w:r/>
+            <w:r>
+              <w:rPr>
+                <w:rFonts w:ascii="Calibri" w:hAnsi="Calibri" w:cs="Calibri" w:eastAsia="Calibri"/>
+                <w:b/>
+                <w:i w:val="0"/>
+                <w:color w:val="2D2D2D"/>
+                <w:sz w:val="20"/>
+              </w:rPr>
+              <w:t>Database</w:t>
+            </w:r>
+          </w:p>
+        </w:tc>
+        <w:tc>
+          <w:tcPr>
+            <w:tcW w:type="dxa" w:w="6917"/>
+            <w:tcBorders>
+              <w:top w:val="single" w:sz="4" w:space="0" w:color="BFBFBF"/>
+              <w:left w:val="single" w:sz="4" w:space="0" w:color="BFBFBF"/>
+              <w:bottom w:val="single" w:sz="4" w:space="0" w:color="BFBFBF"/>
+              <w:right w:val="single" w:sz="4" w:space="0" w:color="BFBFBF"/>
+            </w:tcBorders>
+          </w:tcPr>
+          <w:p>
+            <w:pPr>
+              <w:spacing w:before="40" w:after="40"/>
+            </w:pPr>
+            <w:r/>
+            <w:r>
+              <w:rPr>
+                <w:rFonts w:ascii="Calibri" w:hAnsi="Calibri" w:cs="Calibri" w:eastAsia="Calibri"/>
+                <w:b w:val="0"/>
+                <w:i w:val="0"/>
+                <w:color w:val="2D2D2D"/>
+                <w:sz w:val="20"/>
+              </w:rPr>
+              <w:t>sat_nobleoutlook (derived from your client ID — do not send this)</w:t>
+            </w:r>
+          </w:p>
+        </w:tc>
+      </w:tr>
+      <w:tr>
+        <w:trPr>
+          <w:cantSplit/>
+        </w:trPr>
+        <w:tc>
+          <w:tcPr>
+            <w:tcW w:type="dxa" w:w="2948"/>
+            <w:shd w:fill="E9F0F7" w:val="clear"/>
+            <w:tcBorders>
+              <w:top w:val="single" w:sz="4" w:space="0" w:color="BFBFBF"/>
+              <w:left w:val="single" w:sz="4" w:space="0" w:color="BFBFBF"/>
+              <w:bottom w:val="single" w:sz="4" w:space="0" w:color="BFBFBF"/>
+              <w:right w:val="single" w:sz="4" w:space="0" w:color="BFBFBF"/>
+            </w:tcBorders>
+          </w:tcPr>
+          <w:p>
+            <w:pPr>
+              <w:spacing w:before="40" w:after="40"/>
+            </w:pPr>
+            <w:r/>
+            <w:r>
+              <w:rPr>
+                <w:rFonts w:ascii="Calibri" w:hAnsi="Calibri" w:cs="Calibri" w:eastAsia="Calibri"/>
+                <w:b/>
+                <w:i w:val="0"/>
+                <w:color w:val="2D2D2D"/>
+                <w:sz w:val="20"/>
+              </w:rPr>
+              <w:t>Supplier</w:t>
+            </w:r>
+          </w:p>
+        </w:tc>
+        <w:tc>
+          <w:tcPr>
+            <w:tcW w:type="dxa" w:w="6917"/>
+            <w:tcBorders>
+              <w:top w:val="single" w:sz="4" w:space="0" w:color="BFBFBF"/>
+              <w:left w:val="single" w:sz="4" w:space="0" w:color="BFBFBF"/>
+              <w:bottom w:val="single" w:sz="4" w:space="0" w:color="BFBFBF"/>
+              <w:right w:val="single" w:sz="4" w:space="0" w:color="BFBFBF"/>
+            </w:tcBorders>
+          </w:tcPr>
+          <w:p>
+            <w:pPr>
+              <w:spacing w:before="40" w:after="40"/>
+            </w:pPr>
+            <w:r/>
+            <w:r>
+              <w:rPr>
+                <w:rFonts w:ascii="Calibri" w:hAnsi="Calibri" w:cs="Calibri" w:eastAsia="Calibri"/>
+                <w:b w:val="0"/>
+                <w:i w:val="0"/>
+                <w:color w:val="2D2D2D"/>
+                <w:sz w:val="20"/>
+              </w:rPr>
+              <w:t>RECKITT BENCKISER (derived from your client ID — do not send this)</w:t>
+            </w:r>
+          </w:p>
+        </w:tc>
+      </w:tr>
+      <w:tr>
+        <w:trPr>
+          <w:cantSplit/>
+        </w:trPr>
         <w:tc>
           <w:tcPr>
             <w:tcW w:type="dxa" w:w="2948"/>
@@ -378,6 +523,9 @@
         </w:tc>
       </w:tr>
       <w:tr>
+        <w:trPr>
+          <w:cantSplit/>
+        </w:trPr>
         <w:tc>
           <w:tcPr>
             <w:tcW w:type="dxa" w:w="2948"/>
@@ -435,6 +583,9 @@
         </w:tc>
       </w:tr>
       <w:tr>
+        <w:trPr>
+          <w:cantSplit/>
+        </w:trPr>
         <w:tc>
           <w:tcPr>
             <w:tcW w:type="dxa" w:w="2948"/>
@@ -499,6 +650,8 @@
     </w:p>
     <w:p>
       <w:pPr>
+        <w:keepNext w:val="0"/>
+        <w:keepLines/>
         <w:spacing w:before="0" w:after="80" w:line="276" w:lineRule="auto"/>
       </w:pPr>
       <w:r>
@@ -524,6 +677,9 @@
         <w:gridCol w:w="6917"/>
       </w:tblGrid>
       <w:tr>
+        <w:trPr>
+          <w:cantSplit/>
+        </w:trPr>
         <w:tc>
           <w:tcPr>
             <w:tcW w:type="dxa" w:w="2948"/>
@@ -582,6 +738,9 @@
         </w:tc>
       </w:tr>
       <w:tr>
+        <w:trPr>
+          <w:cantSplit/>
+        </w:trPr>
         <w:tc>
           <w:tcPr>
             <w:tcW w:type="dxa" w:w="2948"/>
@@ -640,6 +799,9 @@
         </w:tc>
       </w:tr>
       <w:tr>
+        <w:trPr>
+          <w:cantSplit/>
+        </w:trPr>
         <w:tc>
           <w:tcPr>
             <w:tcW w:type="dxa" w:w="2948"/>
@@ -698,6 +860,9 @@
         </w:tc>
       </w:tr>
       <w:tr>
+        <w:trPr>
+          <w:cantSplit/>
+        </w:trPr>
         <w:tc>
           <w:tcPr>
             <w:tcW w:type="dxa" w:w="2948"/>
@@ -756,6 +921,9 @@
         </w:tc>
       </w:tr>
       <w:tr>
+        <w:trPr>
+          <w:cantSplit/>
+        </w:trPr>
         <w:tc>
           <w:tcPr>
             <w:tcW w:type="dxa" w:w="2948"/>
@@ -821,6 +989,8 @@
     </w:p>
     <w:p>
       <w:pPr>
+        <w:keepNext w:val="0"/>
+        <w:keepLines/>
         <w:spacing w:before="0" w:after="80" w:line="276" w:lineRule="auto"/>
       </w:pPr>
       <w:r>
@@ -846,6 +1016,9 @@
         <w:gridCol w:w="6917"/>
       </w:tblGrid>
       <w:tr>
+        <w:trPr>
+          <w:cantSplit/>
+        </w:trPr>
         <w:tc>
           <w:tcPr>
             <w:tcW w:type="dxa" w:w="2948"/>
@@ -904,6 +1077,9 @@
         </w:tc>
       </w:tr>
       <w:tr>
+        <w:trPr>
+          <w:cantSplit/>
+        </w:trPr>
         <w:tc>
           <w:tcPr>
             <w:tcW w:type="dxa" w:w="2948"/>
@@ -962,6 +1138,9 @@
         </w:tc>
       </w:tr>
       <w:tr>
+        <w:trPr>
+          <w:cantSplit/>
+        </w:trPr>
         <w:tc>
           <w:tcPr>
             <w:tcW w:type="dxa" w:w="2948"/>
@@ -1042,6 +1221,8 @@
     </w:p>
     <w:p>
       <w:pPr>
+        <w:keepNext w:val="0"/>
+        <w:keepLines/>
         <w:spacing w:before="0" w:after="120" w:line="276" w:lineRule="auto"/>
       </w:pPr>
       <w:r>
@@ -1105,6 +1286,8 @@
     </w:p>
     <w:p>
       <w:pPr>
+        <w:keepNext/>
+        <w:keepLines/>
         <w:spacing w:before="160" w:after="80" w:line="276" w:lineRule="auto"/>
       </w:pPr>
       <w:r>
@@ -1129,6 +1312,9 @@
         <w:gridCol w:w="9866"/>
       </w:tblGrid>
       <w:tr>
+        <w:trPr>
+          <w:cantSplit/>
+        </w:trPr>
         <w:tc>
           <w:tcPr>
             <w:tcW w:type="dxa" w:w="9866"/>
@@ -1142,6 +1328,7 @@
           </w:tcPr>
           <w:p>
             <w:pPr>
+              <w:keepLines/>
               <w:spacing w:before="80" w:after="80" w:line="264" w:lineRule="auto"/>
             </w:pPr>
             <w:r/>
@@ -1176,6 +1363,8 @@
     </w:p>
     <w:p>
       <w:pPr>
+        <w:keepNext w:val="0"/>
+        <w:keepLines/>
         <w:spacing w:before="0" w:after="80" w:line="276" w:lineRule="auto"/>
       </w:pPr>
       <w:r>
@@ -1202,6 +1391,9 @@
         <w:gridCol w:w="5783"/>
       </w:tblGrid>
       <w:tr>
+        <w:trPr>
+          <w:cantSplit/>
+        </w:trPr>
         <w:tc>
           <w:tcPr>
             <w:tcW w:type="dxa" w:w="2495"/>
@@ -1288,6 +1480,9 @@
         </w:tc>
       </w:tr>
       <w:tr>
+        <w:trPr>
+          <w:cantSplit/>
+        </w:trPr>
         <w:tc>
           <w:tcPr>
             <w:tcW w:type="dxa" w:w="2495"/>
@@ -1374,6 +1569,9 @@
         </w:tc>
       </w:tr>
       <w:tr>
+        <w:trPr>
+          <w:cantSplit/>
+        </w:trPr>
         <w:tc>
           <w:tcPr>
             <w:tcW w:type="dxa" w:w="2495"/>
@@ -1460,6 +1658,9 @@
         </w:tc>
       </w:tr>
       <w:tr>
+        <w:trPr>
+          <w:cantSplit/>
+        </w:trPr>
         <w:tc>
           <w:tcPr>
             <w:tcW w:type="dxa" w:w="2495"/>
@@ -1546,6 +1747,9 @@
         </w:tc>
       </w:tr>
       <w:tr>
+        <w:trPr>
+          <w:cantSplit/>
+        </w:trPr>
         <w:tc>
           <w:tcPr>
             <w:tcW w:type="dxa" w:w="2495"/>
@@ -1639,6 +1843,8 @@
     </w:p>
     <w:p>
       <w:pPr>
+        <w:keepNext/>
+        <w:keepLines/>
         <w:spacing w:before="0" w:after="80" w:line="276" w:lineRule="auto"/>
       </w:pPr>
       <w:r>
@@ -1663,6 +1869,9 @@
         <w:gridCol w:w="9866"/>
       </w:tblGrid>
       <w:tr>
+        <w:trPr>
+          <w:cantSplit/>
+        </w:trPr>
         <w:tc>
           <w:tcPr>
             <w:tcW w:type="dxa" w:w="9866"/>
@@ -1676,6 +1885,7 @@
           </w:tcPr>
           <w:p>
             <w:pPr>
+              <w:keepLines/>
               <w:spacing w:before="80" w:after="80" w:line="264" w:lineRule="auto"/>
             </w:pPr>
             <w:r/>
@@ -1820,6 +2030,8 @@
     </w:p>
     <w:p>
       <w:pPr>
+        <w:keepNext w:val="0"/>
+        <w:keepLines/>
         <w:spacing w:before="0" w:after="160" w:line="276" w:lineRule="auto"/>
       </w:pPr>
       <w:r>
@@ -1845,6 +2057,9 @@
         <w:gridCol w:w="6917"/>
       </w:tblGrid>
       <w:tr>
+        <w:trPr>
+          <w:cantSplit/>
+        </w:trPr>
         <w:tc>
           <w:tcPr>
             <w:tcW w:type="dxa" w:w="2948"/>
@@ -1903,6 +2118,9 @@
         </w:tc>
       </w:tr>
       <w:tr>
+        <w:trPr>
+          <w:cantSplit/>
+        </w:trPr>
         <w:tc>
           <w:tcPr>
             <w:tcW w:type="dxa" w:w="2948"/>
@@ -1961,6 +2179,9 @@
         </w:tc>
       </w:tr>
       <w:tr>
+        <w:trPr>
+          <w:cantSplit/>
+        </w:trPr>
         <w:tc>
           <w:tcPr>
             <w:tcW w:type="dxa" w:w="2948"/>
@@ -2019,6 +2240,9 @@
         </w:tc>
       </w:tr>
       <w:tr>
+        <w:trPr>
+          <w:cantSplit/>
+        </w:trPr>
         <w:tc>
           <w:tcPr>
             <w:tcW w:type="dxa" w:w="2948"/>
@@ -2077,6 +2301,9 @@
         </w:tc>
       </w:tr>
       <w:tr>
+        <w:trPr>
+          <w:cantSplit/>
+        </w:trPr>
         <w:tc>
           <w:tcPr>
             <w:tcW w:type="dxa" w:w="2948"/>
@@ -2142,6 +2369,8 @@
     </w:p>
     <w:p>
       <w:pPr>
+        <w:keepNext/>
+        <w:keepLines/>
         <w:spacing w:before="0" w:after="80" w:line="276" w:lineRule="auto"/>
       </w:pPr>
       <w:r>
@@ -2166,6 +2395,9 @@
         <w:gridCol w:w="9866"/>
       </w:tblGrid>
       <w:tr>
+        <w:trPr>
+          <w:cantSplit/>
+        </w:trPr>
         <w:tc>
           <w:tcPr>
             <w:tcW w:type="dxa" w:w="9866"/>
@@ -2179,6 +2411,7 @@
           </w:tcPr>
           <w:p>
             <w:pPr>
+              <w:keepLines/>
               <w:spacing w:before="80" w:after="80" w:line="264" w:lineRule="auto"/>
             </w:pPr>
             <w:r/>
@@ -2253,6 +2486,8 @@
     </w:p>
     <w:p>
       <w:pPr>
+        <w:keepNext/>
+        <w:keepLines/>
         <w:spacing w:before="0" w:after="80" w:line="276" w:lineRule="auto"/>
       </w:pPr>
       <w:r>
@@ -2277,6 +2512,9 @@
         <w:gridCol w:w="9866"/>
       </w:tblGrid>
       <w:tr>
+        <w:trPr>
+          <w:cantSplit/>
+        </w:trPr>
         <w:tc>
           <w:tcPr>
             <w:tcW w:type="dxa" w:w="9866"/>
@@ -2290,6 +2528,7 @@
           </w:tcPr>
           <w:p>
             <w:pPr>
+              <w:keepLines/>
               <w:spacing w:before="80" w:after="80" w:line="264" w:lineRule="auto"/>
             </w:pPr>
             <w:r/>
@@ -2360,6 +2599,8 @@
     </w:p>
     <w:p>
       <w:pPr>
+        <w:keepNext w:val="0"/>
+        <w:keepLines/>
         <w:spacing w:before="0" w:after="160" w:line="276" w:lineRule="auto"/>
       </w:pPr>
       <w:r>
@@ -2402,6 +2643,9 @@
         <w:gridCol w:w="4196"/>
       </w:tblGrid>
       <w:tr>
+        <w:trPr>
+          <w:cantSplit/>
+        </w:trPr>
         <w:tc>
           <w:tcPr>
             <w:tcW w:type="dxa" w:w="680"/>
@@ -2516,6 +2760,9 @@
         </w:tc>
       </w:tr>
       <w:tr>
+        <w:trPr>
+          <w:cantSplit/>
+        </w:trPr>
         <w:tc>
           <w:tcPr>
             <w:tcW w:type="dxa" w:w="680"/>
@@ -2630,6 +2877,9 @@
         </w:tc>
       </w:tr>
       <w:tr>
+        <w:trPr>
+          <w:cantSplit/>
+        </w:trPr>
         <w:tc>
           <w:tcPr>
             <w:tcW w:type="dxa" w:w="680"/>
@@ -2744,6 +2994,9 @@
         </w:tc>
       </w:tr>
       <w:tr>
+        <w:trPr>
+          <w:cantSplit/>
+        </w:trPr>
         <w:tc>
           <w:tcPr>
             <w:tcW w:type="dxa" w:w="680"/>
@@ -2858,6 +3111,9 @@
         </w:tc>
       </w:tr>
       <w:tr>
+        <w:trPr>
+          <w:cantSplit/>
+        </w:trPr>
         <w:tc>
           <w:tcPr>
             <w:tcW w:type="dxa" w:w="680"/>
@@ -2972,6 +3228,9 @@
         </w:tc>
       </w:tr>
       <w:tr>
+        <w:trPr>
+          <w:cantSplit/>
+        </w:trPr>
         <w:tc>
           <w:tcPr>
             <w:tcW w:type="dxa" w:w="680"/>
@@ -3086,6 +3345,9 @@
         </w:tc>
       </w:tr>
       <w:tr>
+        <w:trPr>
+          <w:cantSplit/>
+        </w:trPr>
         <w:tc>
           <w:tcPr>
             <w:tcW w:type="dxa" w:w="680"/>
@@ -3200,6 +3462,9 @@
         </w:tc>
       </w:tr>
       <w:tr>
+        <w:trPr>
+          <w:cantSplit/>
+        </w:trPr>
         <w:tc>
           <w:tcPr>
             <w:tcW w:type="dxa" w:w="680"/>
@@ -3314,6 +3579,9 @@
         </w:tc>
       </w:tr>
       <w:tr>
+        <w:trPr>
+          <w:cantSplit/>
+        </w:trPr>
         <w:tc>
           <w:tcPr>
             <w:tcW w:type="dxa" w:w="680"/>
@@ -3450,6 +3718,8 @@
     </w:p>
     <w:p>
       <w:pPr>
+        <w:keepNext w:val="0"/>
+        <w:keepLines/>
         <w:spacing w:before="0" w:after="120" w:line="276" w:lineRule="auto"/>
       </w:pPr>
       <w:r>
@@ -3476,6 +3746,9 @@
         <w:gridCol w:w="3345"/>
       </w:tblGrid>
       <w:tr>
+        <w:trPr>
+          <w:cantSplit/>
+        </w:trPr>
         <w:tc>
           <w:tcPr>
             <w:tcW w:type="dxa" w:w="3686"/>
@@ -3562,6 +3835,9 @@
         </w:tc>
       </w:tr>
       <w:tr>
+        <w:trPr>
+          <w:cantSplit/>
+        </w:trPr>
         <w:tc>
           <w:tcPr>
             <w:tcW w:type="dxa" w:w="3686"/>
@@ -3648,6 +3924,9 @@
         </w:tc>
       </w:tr>
       <w:tr>
+        <w:trPr>
+          <w:cantSplit/>
+        </w:trPr>
         <w:tc>
           <w:tcPr>
             <w:tcW w:type="dxa" w:w="3686"/>
@@ -3734,6 +4013,9 @@
         </w:tc>
       </w:tr>
       <w:tr>
+        <w:trPr>
+          <w:cantSplit/>
+        </w:trPr>
         <w:tc>
           <w:tcPr>
             <w:tcW w:type="dxa" w:w="3686"/>
@@ -3842,6 +4124,8 @@
     </w:p>
     <w:p>
       <w:pPr>
+        <w:keepNext w:val="0"/>
+        <w:keepLines/>
         <w:spacing w:before="0" w:after="160" w:line="276" w:lineRule="auto"/>
       </w:pPr>
       <w:r>
@@ -3882,6 +4166,9 @@
         <w:gridCol w:w="6917"/>
       </w:tblGrid>
       <w:tr>
+        <w:trPr>
+          <w:cantSplit/>
+        </w:trPr>
         <w:tc>
           <w:tcPr>
             <w:tcW w:type="dxa" w:w="2948"/>
@@ -3939,6 +4226,9 @@
         </w:tc>
       </w:tr>
       <w:tr>
+        <w:trPr>
+          <w:cantSplit/>
+        </w:trPr>
         <w:tc>
           <w:tcPr>
             <w:tcW w:type="dxa" w:w="2948"/>
@@ -3996,6 +4286,9 @@
         </w:tc>
       </w:tr>
       <w:tr>
+        <w:trPr>
+          <w:cantSplit/>
+        </w:trPr>
         <w:tc>
           <w:tcPr>
             <w:tcW w:type="dxa" w:w="2948"/>
@@ -4053,6 +4346,9 @@
         </w:tc>
       </w:tr>
       <w:tr>
+        <w:trPr>
+          <w:cantSplit/>
+        </w:trPr>
         <w:tc>
           <w:tcPr>
             <w:tcW w:type="dxa" w:w="2948"/>
@@ -4117,6 +4413,8 @@
     </w:p>
     <w:p>
       <w:pPr>
+        <w:keepNext w:val="0"/>
+        <w:keepLines/>
         <w:spacing w:before="0" w:after="120" w:line="276" w:lineRule="auto"/>
       </w:pPr>
       <w:r>
@@ -4132,6 +4430,8 @@
     </w:p>
     <w:p>
       <w:pPr>
+        <w:keepNext w:val="0"/>
+        <w:keepLines/>
         <w:spacing w:before="0" w:after="80" w:line="276" w:lineRule="auto"/>
       </w:pPr>
       <w:r>
@@ -4160,6 +4460,9 @@
         <w:gridCol w:w="3856"/>
       </w:tblGrid>
       <w:tr>
+        <w:trPr>
+          <w:cantSplit/>
+        </w:trPr>
         <w:tc>
           <w:tcPr>
             <w:tcW w:type="dxa" w:w="1588"/>
@@ -4302,6 +4605,9 @@
         </w:tc>
       </w:tr>
       <w:tr>
+        <w:trPr>
+          <w:cantSplit/>
+        </w:trPr>
         <w:tc>
           <w:tcPr>
             <w:tcW w:type="dxa" w:w="1588"/>
@@ -4444,6 +4750,9 @@
         </w:tc>
       </w:tr>
       <w:tr>
+        <w:trPr>
+          <w:cantSplit/>
+        </w:trPr>
         <w:tc>
           <w:tcPr>
             <w:tcW w:type="dxa" w:w="1588"/>
@@ -4586,6 +4895,9 @@
         </w:tc>
       </w:tr>
       <w:tr>
+        <w:trPr>
+          <w:cantSplit/>
+        </w:trPr>
         <w:tc>
           <w:tcPr>
             <w:tcW w:type="dxa" w:w="1588"/>
@@ -4735,6 +5047,8 @@
     </w:p>
     <w:p>
       <w:pPr>
+        <w:keepNext/>
+        <w:keepLines/>
         <w:spacing w:before="0" w:after="80" w:line="276" w:lineRule="auto"/>
       </w:pPr>
       <w:r>
@@ -4759,6 +5073,9 @@
         <w:gridCol w:w="9866"/>
       </w:tblGrid>
       <w:tr>
+        <w:trPr>
+          <w:cantSplit/>
+        </w:trPr>
         <w:tc>
           <w:tcPr>
             <w:tcW w:type="dxa" w:w="9866"/>
@@ -4772,6 +5089,7 @@
           </w:tcPr>
           <w:p>
             <w:pPr>
+              <w:keepLines/>
               <w:spacing w:before="80" w:after="80" w:line="264" w:lineRule="auto"/>
             </w:pPr>
             <w:r/>
@@ -4800,6 +5118,8 @@
     </w:p>
     <w:p>
       <w:pPr>
+        <w:keepNext/>
+        <w:keepLines/>
         <w:spacing w:before="0" w:after="80" w:line="276" w:lineRule="auto"/>
       </w:pPr>
       <w:r>
@@ -4824,6 +5144,9 @@
         <w:gridCol w:w="9866"/>
       </w:tblGrid>
       <w:tr>
+        <w:trPr>
+          <w:cantSplit/>
+        </w:trPr>
         <w:tc>
           <w:tcPr>
             <w:tcW w:type="dxa" w:w="9866"/>
@@ -4837,6 +5160,7 @@
           </w:tcPr>
           <w:p>
             <w:pPr>
+              <w:keepLines/>
               <w:spacing w:before="80" w:after="80" w:line="264" w:lineRule="auto"/>
             </w:pPr>
             <w:r/>
@@ -4932,6 +5256,9 @@
         <w:gridCol w:w="6917"/>
       </w:tblGrid>
       <w:tr>
+        <w:trPr>
+          <w:cantSplit/>
+        </w:trPr>
         <w:tc>
           <w:tcPr>
             <w:tcW w:type="dxa" w:w="2948"/>
@@ -4989,6 +5316,9 @@
         </w:tc>
       </w:tr>
       <w:tr>
+        <w:trPr>
+          <w:cantSplit/>
+        </w:trPr>
         <w:tc>
           <w:tcPr>
             <w:tcW w:type="dxa" w:w="2948"/>
@@ -5046,6 +5376,9 @@
         </w:tc>
       </w:tr>
       <w:tr>
+        <w:trPr>
+          <w:cantSplit/>
+        </w:trPr>
         <w:tc>
           <w:tcPr>
             <w:tcW w:type="dxa" w:w="2948"/>
@@ -5103,6 +5436,9 @@
         </w:tc>
       </w:tr>
       <w:tr>
+        <w:trPr>
+          <w:cantSplit/>
+        </w:trPr>
         <w:tc>
           <w:tcPr>
             <w:tcW w:type="dxa" w:w="2948"/>
@@ -5167,6 +5503,8 @@
     </w:p>
     <w:p>
       <w:pPr>
+        <w:keepNext w:val="0"/>
+        <w:keepLines/>
         <w:spacing w:before="0" w:after="120" w:line="276" w:lineRule="auto"/>
       </w:pPr>
       <w:r>
@@ -5182,6 +5520,8 @@
     </w:p>
     <w:p>
       <w:pPr>
+        <w:keepNext w:val="0"/>
+        <w:keepLines/>
         <w:spacing w:before="0" w:after="80" w:line="276" w:lineRule="auto"/>
       </w:pPr>
       <w:r>
@@ -5210,6 +5550,9 @@
         <w:gridCol w:w="3856"/>
       </w:tblGrid>
       <w:tr>
+        <w:trPr>
+          <w:cantSplit/>
+        </w:trPr>
         <w:tc>
           <w:tcPr>
             <w:tcW w:type="dxa" w:w="1588"/>
@@ -5352,6 +5695,9 @@
         </w:tc>
       </w:tr>
       <w:tr>
+        <w:trPr>
+          <w:cantSplit/>
+        </w:trPr>
         <w:tc>
           <w:tcPr>
             <w:tcW w:type="dxa" w:w="1588"/>
@@ -5494,6 +5840,9 @@
         </w:tc>
       </w:tr>
       <w:tr>
+        <w:trPr>
+          <w:cantSplit/>
+        </w:trPr>
         <w:tc>
           <w:tcPr>
             <w:tcW w:type="dxa" w:w="1588"/>
@@ -5636,6 +5985,9 @@
         </w:tc>
       </w:tr>
       <w:tr>
+        <w:trPr>
+          <w:cantSplit/>
+        </w:trPr>
         <w:tc>
           <w:tcPr>
             <w:tcW w:type="dxa" w:w="1588"/>
@@ -5785,6 +6137,8 @@
     </w:p>
     <w:p>
       <w:pPr>
+        <w:keepNext/>
+        <w:keepLines/>
         <w:spacing w:before="0" w:after="80" w:line="276" w:lineRule="auto"/>
       </w:pPr>
       <w:r>
@@ -5809,6 +6163,9 @@
         <w:gridCol w:w="9866"/>
       </w:tblGrid>
       <w:tr>
+        <w:trPr>
+          <w:cantSplit/>
+        </w:trPr>
         <w:tc>
           <w:tcPr>
             <w:tcW w:type="dxa" w:w="9866"/>
@@ -5822,6 +6179,7 @@
           </w:tcPr>
           <w:p>
             <w:pPr>
+              <w:keepLines/>
               <w:spacing w:before="80" w:after="80" w:line="264" w:lineRule="auto"/>
             </w:pPr>
             <w:r/>
@@ -5850,6 +6208,8 @@
     </w:p>
     <w:p>
       <w:pPr>
+        <w:keepNext/>
+        <w:keepLines/>
         <w:spacing w:before="0" w:after="80" w:line="276" w:lineRule="auto"/>
       </w:pPr>
       <w:r>
@@ -5874,6 +6234,9 @@
         <w:gridCol w:w="9866"/>
       </w:tblGrid>
       <w:tr>
+        <w:trPr>
+          <w:cantSplit/>
+        </w:trPr>
         <w:tc>
           <w:tcPr>
             <w:tcW w:type="dxa" w:w="9866"/>
@@ -5887,6 +6250,7 @@
           </w:tcPr>
           <w:p>
             <w:pPr>
+              <w:keepLines/>
               <w:spacing w:before="80" w:after="80" w:line="264" w:lineRule="auto"/>
             </w:pPr>
             <w:r/>
@@ -5980,6 +6344,9 @@
         <w:gridCol w:w="6917"/>
       </w:tblGrid>
       <w:tr>
+        <w:trPr>
+          <w:cantSplit/>
+        </w:trPr>
         <w:tc>
           <w:tcPr>
             <w:tcW w:type="dxa" w:w="2948"/>
@@ -6037,6 +6404,9 @@
         </w:tc>
       </w:tr>
       <w:tr>
+        <w:trPr>
+          <w:cantSplit/>
+        </w:trPr>
         <w:tc>
           <w:tcPr>
             <w:tcW w:type="dxa" w:w="2948"/>
@@ -6094,6 +6464,9 @@
         </w:tc>
       </w:tr>
       <w:tr>
+        <w:trPr>
+          <w:cantSplit/>
+        </w:trPr>
         <w:tc>
           <w:tcPr>
             <w:tcW w:type="dxa" w:w="2948"/>
@@ -6151,6 +6524,9 @@
         </w:tc>
       </w:tr>
       <w:tr>
+        <w:trPr>
+          <w:cantSplit/>
+        </w:trPr>
         <w:tc>
           <w:tcPr>
             <w:tcW w:type="dxa" w:w="2948"/>
@@ -6215,6 +6591,8 @@
     </w:p>
     <w:p>
       <w:pPr>
+        <w:keepNext w:val="0"/>
+        <w:keepLines/>
         <w:spacing w:before="0" w:after="120" w:line="276" w:lineRule="auto"/>
       </w:pPr>
       <w:r>
@@ -6230,6 +6608,8 @@
     </w:p>
     <w:p>
       <w:pPr>
+        <w:keepNext/>
+        <w:keepLines/>
         <w:spacing w:before="0" w:after="80" w:line="276" w:lineRule="auto"/>
       </w:pPr>
       <w:r>
@@ -6254,6 +6634,9 @@
         <w:gridCol w:w="9866"/>
       </w:tblGrid>
       <w:tr>
+        <w:trPr>
+          <w:cantSplit/>
+        </w:trPr>
         <w:tc>
           <w:tcPr>
             <w:tcW w:type="dxa" w:w="9866"/>
@@ -6267,6 +6650,7 @@
           </w:tcPr>
           <w:p>
             <w:pPr>
+              <w:keepLines/>
               <w:spacing w:before="80" w:after="80" w:line="264" w:lineRule="auto"/>
             </w:pPr>
             <w:r/>
@@ -6295,6 +6679,8 @@
     </w:p>
     <w:p>
       <w:pPr>
+        <w:keepNext/>
+        <w:keepLines/>
         <w:spacing w:before="0" w:after="80" w:line="276" w:lineRule="auto"/>
       </w:pPr>
       <w:r>
@@ -6319,6 +6705,9 @@
         <w:gridCol w:w="9866"/>
       </w:tblGrid>
       <w:tr>
+        <w:trPr>
+          <w:cantSplit/>
+        </w:trPr>
         <w:tc>
           <w:tcPr>
             <w:tcW w:type="dxa" w:w="9866"/>
@@ -6332,6 +6721,7 @@
           </w:tcPr>
           <w:p>
             <w:pPr>
+              <w:keepLines/>
               <w:spacing w:before="80" w:after="80" w:line="264" w:lineRule="auto"/>
             </w:pPr>
             <w:r/>
@@ -6397,6 +6787,9 @@
         <w:gridCol w:w="6917"/>
       </w:tblGrid>
       <w:tr>
+        <w:trPr>
+          <w:cantSplit/>
+        </w:trPr>
         <w:tc>
           <w:tcPr>
             <w:tcW w:type="dxa" w:w="2948"/>
@@ -6454,6 +6847,9 @@
         </w:tc>
       </w:tr>
       <w:tr>
+        <w:trPr>
+          <w:cantSplit/>
+        </w:trPr>
         <w:tc>
           <w:tcPr>
             <w:tcW w:type="dxa" w:w="2948"/>
@@ -6511,6 +6907,9 @@
         </w:tc>
       </w:tr>
       <w:tr>
+        <w:trPr>
+          <w:cantSplit/>
+        </w:trPr>
         <w:tc>
           <w:tcPr>
             <w:tcW w:type="dxa" w:w="2948"/>
@@ -6568,6 +6967,9 @@
         </w:tc>
       </w:tr>
       <w:tr>
+        <w:trPr>
+          <w:cantSplit/>
+        </w:trPr>
         <w:tc>
           <w:tcPr>
             <w:tcW w:type="dxa" w:w="2948"/>
@@ -6632,6 +7034,8 @@
     </w:p>
     <w:p>
       <w:pPr>
+        <w:keepNext w:val="0"/>
+        <w:keepLines/>
         <w:spacing w:before="0" w:after="120" w:line="276" w:lineRule="auto"/>
       </w:pPr>
       <w:r>
@@ -6647,6 +7051,8 @@
     </w:p>
     <w:p>
       <w:pPr>
+        <w:keepNext/>
+        <w:keepLines/>
         <w:spacing w:before="0" w:after="80" w:line="276" w:lineRule="auto"/>
       </w:pPr>
       <w:r>
@@ -6671,6 +7077,9 @@
         <w:gridCol w:w="9866"/>
       </w:tblGrid>
       <w:tr>
+        <w:trPr>
+          <w:cantSplit/>
+        </w:trPr>
         <w:tc>
           <w:tcPr>
             <w:tcW w:type="dxa" w:w="9866"/>
@@ -6684,6 +7093,7 @@
           </w:tcPr>
           <w:p>
             <w:pPr>
+              <w:keepLines/>
               <w:spacing w:before="80" w:after="80" w:line="264" w:lineRule="auto"/>
             </w:pPr>
             <w:r/>
@@ -6712,6 +7122,8 @@
     </w:p>
     <w:p>
       <w:pPr>
+        <w:keepNext/>
+        <w:keepLines/>
         <w:spacing w:before="0" w:after="80" w:line="276" w:lineRule="auto"/>
       </w:pPr>
       <w:r>
@@ -6736,6 +7148,9 @@
         <w:gridCol w:w="9866"/>
       </w:tblGrid>
       <w:tr>
+        <w:trPr>
+          <w:cantSplit/>
+        </w:trPr>
         <w:tc>
           <w:tcPr>
             <w:tcW w:type="dxa" w:w="9866"/>
@@ -6749,6 +7164,7 @@
           </w:tcPr>
           <w:p>
             <w:pPr>
+              <w:keepLines/>
               <w:spacing w:before="80" w:after="80" w:line="264" w:lineRule="auto"/>
             </w:pPr>
             <w:r/>
@@ -6820,6 +7236,9 @@
         <w:gridCol w:w="6917"/>
       </w:tblGrid>
       <w:tr>
+        <w:trPr>
+          <w:cantSplit/>
+        </w:trPr>
         <w:tc>
           <w:tcPr>
             <w:tcW w:type="dxa" w:w="2948"/>
@@ -6877,6 +7296,9 @@
         </w:tc>
       </w:tr>
       <w:tr>
+        <w:trPr>
+          <w:cantSplit/>
+        </w:trPr>
         <w:tc>
           <w:tcPr>
             <w:tcW w:type="dxa" w:w="2948"/>
@@ -6934,6 +7356,9 @@
         </w:tc>
       </w:tr>
       <w:tr>
+        <w:trPr>
+          <w:cantSplit/>
+        </w:trPr>
         <w:tc>
           <w:tcPr>
             <w:tcW w:type="dxa" w:w="2948"/>
@@ -6991,6 +7416,9 @@
         </w:tc>
       </w:tr>
       <w:tr>
+        <w:trPr>
+          <w:cantSplit/>
+        </w:trPr>
         <w:tc>
           <w:tcPr>
             <w:tcW w:type="dxa" w:w="2948"/>
@@ -7055,6 +7483,8 @@
     </w:p>
     <w:p>
       <w:pPr>
+        <w:keepNext w:val="0"/>
+        <w:keepLines/>
         <w:spacing w:before="0" w:after="120" w:line="276" w:lineRule="auto"/>
       </w:pPr>
       <w:r>
@@ -7070,6 +7500,8 @@
     </w:p>
     <w:p>
       <w:pPr>
+        <w:keepNext/>
+        <w:keepLines/>
         <w:spacing w:before="0" w:after="80" w:line="276" w:lineRule="auto"/>
       </w:pPr>
       <w:r>
@@ -7094,6 +7526,9 @@
         <w:gridCol w:w="9866"/>
       </w:tblGrid>
       <w:tr>
+        <w:trPr>
+          <w:cantSplit/>
+        </w:trPr>
         <w:tc>
           <w:tcPr>
             <w:tcW w:type="dxa" w:w="9866"/>
@@ -7107,6 +7542,7 @@
           </w:tcPr>
           <w:p>
             <w:pPr>
+              <w:keepLines/>
               <w:spacing w:before="80" w:after="80" w:line="264" w:lineRule="auto"/>
             </w:pPr>
             <w:r/>
@@ -7135,6 +7571,8 @@
     </w:p>
     <w:p>
       <w:pPr>
+        <w:keepNext/>
+        <w:keepLines/>
         <w:spacing w:before="0" w:after="80" w:line="276" w:lineRule="auto"/>
       </w:pPr>
       <w:r>
@@ -7159,6 +7597,9 @@
         <w:gridCol w:w="9866"/>
       </w:tblGrid>
       <w:tr>
+        <w:trPr>
+          <w:cantSplit/>
+        </w:trPr>
         <w:tc>
           <w:tcPr>
             <w:tcW w:type="dxa" w:w="9866"/>
@@ -7172,6 +7613,7 @@
           </w:tcPr>
           <w:p>
             <w:pPr>
+              <w:keepLines/>
               <w:spacing w:before="80" w:after="80" w:line="264" w:lineRule="auto"/>
             </w:pPr>
             <w:r/>
@@ -7241,6 +7683,9 @@
         <w:gridCol w:w="6917"/>
       </w:tblGrid>
       <w:tr>
+        <w:trPr>
+          <w:cantSplit/>
+        </w:trPr>
         <w:tc>
           <w:tcPr>
             <w:tcW w:type="dxa" w:w="2948"/>
@@ -7298,6 +7743,9 @@
         </w:tc>
       </w:tr>
       <w:tr>
+        <w:trPr>
+          <w:cantSplit/>
+        </w:trPr>
         <w:tc>
           <w:tcPr>
             <w:tcW w:type="dxa" w:w="2948"/>
@@ -7355,6 +7803,9 @@
         </w:tc>
       </w:tr>
       <w:tr>
+        <w:trPr>
+          <w:cantSplit/>
+        </w:trPr>
         <w:tc>
           <w:tcPr>
             <w:tcW w:type="dxa" w:w="2948"/>
@@ -7412,6 +7863,9 @@
         </w:tc>
       </w:tr>
       <w:tr>
+        <w:trPr>
+          <w:cantSplit/>
+        </w:trPr>
         <w:tc>
           <w:tcPr>
             <w:tcW w:type="dxa" w:w="2948"/>
@@ -7476,6 +7930,8 @@
     </w:p>
     <w:p>
       <w:pPr>
+        <w:keepNext w:val="0"/>
+        <w:keepLines/>
         <w:spacing w:before="0" w:after="120" w:line="276" w:lineRule="auto"/>
       </w:pPr>
       <w:r>
@@ -7491,6 +7947,8 @@
     </w:p>
     <w:p>
       <w:pPr>
+        <w:keepNext w:val="0"/>
+        <w:keepLines/>
         <w:spacing w:before="0" w:after="80" w:line="276" w:lineRule="auto"/>
       </w:pPr>
       <w:r>
@@ -7519,6 +7977,9 @@
         <w:gridCol w:w="3856"/>
       </w:tblGrid>
       <w:tr>
+        <w:trPr>
+          <w:cantSplit/>
+        </w:trPr>
         <w:tc>
           <w:tcPr>
             <w:tcW w:type="dxa" w:w="1588"/>
@@ -7661,6 +8122,9 @@
         </w:tc>
       </w:tr>
       <w:tr>
+        <w:trPr>
+          <w:cantSplit/>
+        </w:trPr>
         <w:tc>
           <w:tcPr>
             <w:tcW w:type="dxa" w:w="1588"/>
@@ -7803,6 +8267,9 @@
         </w:tc>
       </w:tr>
       <w:tr>
+        <w:trPr>
+          <w:cantSplit/>
+        </w:trPr>
         <w:tc>
           <w:tcPr>
             <w:tcW w:type="dxa" w:w="1588"/>
@@ -7945,6 +8412,9 @@
         </w:tc>
       </w:tr>
       <w:tr>
+        <w:trPr>
+          <w:cantSplit/>
+        </w:trPr>
         <w:tc>
           <w:tcPr>
             <w:tcW w:type="dxa" w:w="1588"/>
@@ -8094,6 +8564,8 @@
     </w:p>
     <w:p>
       <w:pPr>
+        <w:keepNext/>
+        <w:keepLines/>
         <w:spacing w:before="0" w:after="80" w:line="276" w:lineRule="auto"/>
       </w:pPr>
       <w:r>
@@ -8118,6 +8590,9 @@
         <w:gridCol w:w="9866"/>
       </w:tblGrid>
       <w:tr>
+        <w:trPr>
+          <w:cantSplit/>
+        </w:trPr>
         <w:tc>
           <w:tcPr>
             <w:tcW w:type="dxa" w:w="9866"/>
@@ -8131,6 +8606,7 @@
           </w:tcPr>
           <w:p>
             <w:pPr>
+              <w:keepLines/>
               <w:spacing w:before="80" w:after="80" w:line="264" w:lineRule="auto"/>
             </w:pPr>
             <w:r/>
@@ -8159,6 +8635,8 @@
     </w:p>
     <w:p>
       <w:pPr>
+        <w:keepNext/>
+        <w:keepLines/>
         <w:spacing w:before="0" w:after="80" w:line="276" w:lineRule="auto"/>
       </w:pPr>
       <w:r>
@@ -8183,6 +8661,9 @@
         <w:gridCol w:w="9866"/>
       </w:tblGrid>
       <w:tr>
+        <w:trPr>
+          <w:cantSplit/>
+        </w:trPr>
         <w:tc>
           <w:tcPr>
             <w:tcW w:type="dxa" w:w="9866"/>
@@ -8196,6 +8677,7 @@
           </w:tcPr>
           <w:p>
             <w:pPr>
+              <w:keepLines/>
               <w:spacing w:before="80" w:after="80" w:line="264" w:lineRule="auto"/>
             </w:pPr>
             <w:r/>
@@ -8283,6 +8765,9 @@
         <w:gridCol w:w="6917"/>
       </w:tblGrid>
       <w:tr>
+        <w:trPr>
+          <w:cantSplit/>
+        </w:trPr>
         <w:tc>
           <w:tcPr>
             <w:tcW w:type="dxa" w:w="2948"/>
@@ -8340,6 +8825,9 @@
         </w:tc>
       </w:tr>
       <w:tr>
+        <w:trPr>
+          <w:cantSplit/>
+        </w:trPr>
         <w:tc>
           <w:tcPr>
             <w:tcW w:type="dxa" w:w="2948"/>
@@ -8397,6 +8885,9 @@
         </w:tc>
       </w:tr>
       <w:tr>
+        <w:trPr>
+          <w:cantSplit/>
+        </w:trPr>
         <w:tc>
           <w:tcPr>
             <w:tcW w:type="dxa" w:w="2948"/>
@@ -8454,6 +8945,9 @@
         </w:tc>
       </w:tr>
       <w:tr>
+        <w:trPr>
+          <w:cantSplit/>
+        </w:trPr>
         <w:tc>
           <w:tcPr>
             <w:tcW w:type="dxa" w:w="2948"/>
@@ -8518,6 +9012,8 @@
     </w:p>
     <w:p>
       <w:pPr>
+        <w:keepNext w:val="0"/>
+        <w:keepLines/>
         <w:spacing w:before="0" w:after="120" w:line="276" w:lineRule="auto"/>
       </w:pPr>
       <w:r>
@@ -8533,6 +9029,8 @@
     </w:p>
     <w:p>
       <w:pPr>
+        <w:keepNext w:val="0"/>
+        <w:keepLines/>
         <w:spacing w:before="0" w:after="80" w:line="276" w:lineRule="auto"/>
       </w:pPr>
       <w:r>
@@ -8561,6 +9059,9 @@
         <w:gridCol w:w="3856"/>
       </w:tblGrid>
       <w:tr>
+        <w:trPr>
+          <w:cantSplit/>
+        </w:trPr>
         <w:tc>
           <w:tcPr>
             <w:tcW w:type="dxa" w:w="1588"/>
@@ -8703,6 +9204,9 @@
         </w:tc>
       </w:tr>
       <w:tr>
+        <w:trPr>
+          <w:cantSplit/>
+        </w:trPr>
         <w:tc>
           <w:tcPr>
             <w:tcW w:type="dxa" w:w="1588"/>
@@ -8852,6 +9356,8 @@
     </w:p>
     <w:p>
       <w:pPr>
+        <w:keepNext/>
+        <w:keepLines/>
         <w:spacing w:before="0" w:after="80" w:line="276" w:lineRule="auto"/>
       </w:pPr>
       <w:r>
@@ -8876,6 +9382,9 @@
         <w:gridCol w:w="9866"/>
       </w:tblGrid>
       <w:tr>
+        <w:trPr>
+          <w:cantSplit/>
+        </w:trPr>
         <w:tc>
           <w:tcPr>
             <w:tcW w:type="dxa" w:w="9866"/>
@@ -8889,6 +9398,7 @@
           </w:tcPr>
           <w:p>
             <w:pPr>
+              <w:keepLines/>
               <w:spacing w:before="80" w:after="80" w:line="264" w:lineRule="auto"/>
             </w:pPr>
             <w:r/>
@@ -8917,6 +9427,8 @@
     </w:p>
     <w:p>
       <w:pPr>
+        <w:keepNext/>
+        <w:keepLines/>
         <w:spacing w:before="0" w:after="80" w:line="276" w:lineRule="auto"/>
       </w:pPr>
       <w:r>
@@ -8941,6 +9453,9 @@
         <w:gridCol w:w="9866"/>
       </w:tblGrid>
       <w:tr>
+        <w:trPr>
+          <w:cantSplit/>
+        </w:trPr>
         <w:tc>
           <w:tcPr>
             <w:tcW w:type="dxa" w:w="9866"/>
@@ -8954,6 +9469,7 @@
           </w:tcPr>
           <w:p>
             <w:pPr>
+              <w:keepLines/>
               <w:spacing w:before="80" w:after="80" w:line="264" w:lineRule="auto"/>
             </w:pPr>
             <w:r/>
@@ -9025,6 +9541,9 @@
         <w:gridCol w:w="6917"/>
       </w:tblGrid>
       <w:tr>
+        <w:trPr>
+          <w:cantSplit/>
+        </w:trPr>
         <w:tc>
           <w:tcPr>
             <w:tcW w:type="dxa" w:w="2948"/>
@@ -9082,6 +9601,9 @@
         </w:tc>
       </w:tr>
       <w:tr>
+        <w:trPr>
+          <w:cantSplit/>
+        </w:trPr>
         <w:tc>
           <w:tcPr>
             <w:tcW w:type="dxa" w:w="2948"/>
@@ -9139,6 +9661,9 @@
         </w:tc>
       </w:tr>
       <w:tr>
+        <w:trPr>
+          <w:cantSplit/>
+        </w:trPr>
         <w:tc>
           <w:tcPr>
             <w:tcW w:type="dxa" w:w="2948"/>
@@ -9196,6 +9721,9 @@
         </w:tc>
       </w:tr>
       <w:tr>
+        <w:trPr>
+          <w:cantSplit/>
+        </w:trPr>
         <w:tc>
           <w:tcPr>
             <w:tcW w:type="dxa" w:w="2948"/>
@@ -9260,6 +9788,8 @@
     </w:p>
     <w:p>
       <w:pPr>
+        <w:keepNext w:val="0"/>
+        <w:keepLines/>
         <w:spacing w:before="0" w:after="120" w:line="276" w:lineRule="auto"/>
       </w:pPr>
       <w:r>
@@ -9275,6 +9805,8 @@
     </w:p>
     <w:p>
       <w:pPr>
+        <w:keepNext/>
+        <w:keepLines/>
         <w:spacing w:before="0" w:after="80" w:line="276" w:lineRule="auto"/>
       </w:pPr>
       <w:r>
@@ -9299,6 +9831,9 @@
         <w:gridCol w:w="9866"/>
       </w:tblGrid>
       <w:tr>
+        <w:trPr>
+          <w:cantSplit/>
+        </w:trPr>
         <w:tc>
           <w:tcPr>
             <w:tcW w:type="dxa" w:w="9866"/>
@@ -9312,6 +9847,7 @@
           </w:tcPr>
           <w:p>
             <w:pPr>
+              <w:keepLines/>
               <w:spacing w:before="80" w:after="80" w:line="264" w:lineRule="auto"/>
             </w:pPr>
             <w:r/>
@@ -9340,6 +9876,8 @@
     </w:p>
     <w:p>
       <w:pPr>
+        <w:keepNext/>
+        <w:keepLines/>
         <w:spacing w:before="0" w:after="80" w:line="276" w:lineRule="auto"/>
       </w:pPr>
       <w:r>
@@ -9364,6 +9902,9 @@
         <w:gridCol w:w="9866"/>
       </w:tblGrid>
       <w:tr>
+        <w:trPr>
+          <w:cantSplit/>
+        </w:trPr>
         <w:tc>
           <w:tcPr>
             <w:tcW w:type="dxa" w:w="9866"/>
@@ -9377,6 +9918,7 @@
           </w:tcPr>
           <w:p>
             <w:pPr>
+              <w:keepLines/>
               <w:spacing w:before="80" w:after="80" w:line="264" w:lineRule="auto"/>
             </w:pPr>
             <w:r/>
@@ -9442,6 +9984,9 @@
         <w:gridCol w:w="7314"/>
       </w:tblGrid>
       <w:tr>
+        <w:trPr>
+          <w:cantSplit/>
+        </w:trPr>
         <w:tc>
           <w:tcPr>
             <w:tcW w:type="dxa" w:w="2552"/>
@@ -9500,6 +10045,9 @@
         </w:tc>
       </w:tr>
       <w:tr>
+        <w:trPr>
+          <w:cantSplit/>
+        </w:trPr>
         <w:tc>
           <w:tcPr>
             <w:tcW w:type="dxa" w:w="2552"/>
@@ -9558,6 +10106,9 @@
         </w:tc>
       </w:tr>
       <w:tr>
+        <w:trPr>
+          <w:cantSplit/>
+        </w:trPr>
         <w:tc>
           <w:tcPr>
             <w:tcW w:type="dxa" w:w="2552"/>
@@ -9616,6 +10167,9 @@
         </w:tc>
       </w:tr>
       <w:tr>
+        <w:trPr>
+          <w:cantSplit/>
+        </w:trPr>
         <w:tc>
           <w:tcPr>
             <w:tcW w:type="dxa" w:w="2552"/>
@@ -9674,6 +10228,9 @@
         </w:tc>
       </w:tr>
       <w:tr>
+        <w:trPr>
+          <w:cantSplit/>
+        </w:trPr>
         <w:tc>
           <w:tcPr>
             <w:tcW w:type="dxa" w:w="2552"/>
@@ -9732,6 +10289,9 @@
         </w:tc>
       </w:tr>
       <w:tr>
+        <w:trPr>
+          <w:cantSplit/>
+        </w:trPr>
         <w:tc>
           <w:tcPr>
             <w:tcW w:type="dxa" w:w="2552"/>
@@ -9789,11 +10349,153 @@
           </w:p>
         </w:tc>
       </w:tr>
+    </w:tbl>
+    <w:p>
+      <w:pPr>
+        <w:spacing w:after="80"/>
+      </w:pPr>
+    </w:p>
+    <w:p>
+      <w:pPr>
+        <w:keepNext w:val="0"/>
+        <w:keepLines/>
+        <w:spacing w:before="160" w:after="80" w:line="276" w:lineRule="auto"/>
+      </w:pPr>
+      <w:r>
+        <w:rPr>
+          <w:rFonts w:ascii="Calibri" w:hAnsi="Calibri" w:cs="Calibri" w:eastAsia="Calibri"/>
+          <w:b w:val="0"/>
+          <w:i w:val="0"/>
+          <w:color w:val="2D2D2D"/>
+          <w:sz w:val="22"/>
+        </w:rPr>
+        <w:t>If you need a different date window, change only fromDate and toDate. Keep the YYYY-MM-DD format.</w:t>
+      </w:r>
+    </w:p>
+    <w:p>
+      <w:pPr>
+        <w:pStyle w:val="Heading1"/>
+      </w:pPr>
+      <w:r>
+        <w:rPr>
+          <w:rFonts w:ascii="Calibri" w:hAnsi="Calibri" w:cs="Calibri" w:eastAsia="Calibri"/>
+          <w:b/>
+          <w:i w:val="0"/>
+          <w:color w:val="1F4E79"/>
+          <w:sz w:val="32"/>
+        </w:rPr>
+        <w:t>9. Troubleshooting</w:t>
+      </w:r>
+    </w:p>
+    <w:tbl>
+      <w:tblPr>
+        <w:tblW w:type="dxa" w:w="9865"/>
+        <w:jc w:val="center"/>
+        <w:tblLayout w:type="fixed"/>
+        <w:tblLook w:firstColumn="1" w:firstRow="1" w:lastColumn="0" w:lastRow="0" w:noHBand="0" w:noVBand="1" w:val="04A0"/>
+      </w:tblPr>
+      <w:tblGrid>
+        <w:gridCol w:w="2381"/>
+        <w:gridCol w:w="3742"/>
+        <w:gridCol w:w="3742"/>
+      </w:tblGrid>
       <w:tr>
+        <w:trPr>
+          <w:cantSplit/>
+        </w:trPr>
         <w:tc>
           <w:tcPr>
-            <w:tcW w:type="dxa" w:w="2552"/>
-            <w:shd w:fill="E9F0F7" w:val="clear"/>
+            <w:tcW w:type="dxa" w:w="2381"/>
+            <w:shd w:fill="1F4E79" w:val="clear"/>
+            <w:tcBorders>
+              <w:top w:val="single" w:sz="4" w:space="0" w:color="BFBFBF"/>
+              <w:left w:val="single" w:sz="4" w:space="0" w:color="BFBFBF"/>
+              <w:bottom w:val="single" w:sz="4" w:space="0" w:color="BFBFBF"/>
+              <w:right w:val="single" w:sz="4" w:space="0" w:color="BFBFBF"/>
+            </w:tcBorders>
+          </w:tcPr>
+          <w:p>
+            <w:pPr>
+              <w:spacing w:before="40" w:after="40"/>
+            </w:pPr>
+            <w:r/>
+            <w:r>
+              <w:rPr>
+                <w:rFonts w:ascii="Calibri" w:hAnsi="Calibri" w:cs="Calibri" w:eastAsia="Calibri"/>
+                <w:b/>
+                <w:i w:val="0"/>
+                <w:color w:val="FFFFFF"/>
+                <w:sz w:val="19"/>
+              </w:rPr>
+              <w:t>HTTP status</w:t>
+            </w:r>
+          </w:p>
+        </w:tc>
+        <w:tc>
+          <w:tcPr>
+            <w:tcW w:type="dxa" w:w="3742"/>
+            <w:shd w:fill="1F4E79" w:val="clear"/>
+            <w:tcBorders>
+              <w:top w:val="single" w:sz="4" w:space="0" w:color="BFBFBF"/>
+              <w:left w:val="single" w:sz="4" w:space="0" w:color="BFBFBF"/>
+              <w:bottom w:val="single" w:sz="4" w:space="0" w:color="BFBFBF"/>
+              <w:right w:val="single" w:sz="4" w:space="0" w:color="BFBFBF"/>
+            </w:tcBorders>
+          </w:tcPr>
+          <w:p>
+            <w:pPr>
+              <w:spacing w:before="40" w:after="40"/>
+            </w:pPr>
+            <w:r/>
+            <w:r>
+              <w:rPr>
+                <w:rFonts w:ascii="Calibri" w:hAnsi="Calibri" w:cs="Calibri" w:eastAsia="Calibri"/>
+                <w:b/>
+                <w:i w:val="0"/>
+                <w:color w:val="FFFFFF"/>
+                <w:sz w:val="19"/>
+              </w:rPr>
+              <w:t>Likely cause</w:t>
+            </w:r>
+          </w:p>
+        </w:tc>
+        <w:tc>
+          <w:tcPr>
+            <w:tcW w:type="dxa" w:w="3742"/>
+            <w:shd w:fill="1F4E79" w:val="clear"/>
+            <w:tcBorders>
+              <w:top w:val="single" w:sz="4" w:space="0" w:color="BFBFBF"/>
+              <w:left w:val="single" w:sz="4" w:space="0" w:color="BFBFBF"/>
+              <w:bottom w:val="single" w:sz="4" w:space="0" w:color="BFBFBF"/>
+              <w:right w:val="single" w:sz="4" w:space="0" w:color="BFBFBF"/>
+            </w:tcBorders>
+          </w:tcPr>
+          <w:p>
+            <w:pPr>
+              <w:spacing w:before="40" w:after="40"/>
+            </w:pPr>
+            <w:r/>
+            <w:r>
+              <w:rPr>
+                <w:rFonts w:ascii="Calibri" w:hAnsi="Calibri" w:cs="Calibri" w:eastAsia="Calibri"/>
+                <w:b/>
+                <w:i w:val="0"/>
+                <w:color w:val="FFFFFF"/>
+                <w:sz w:val="19"/>
+              </w:rPr>
+              <w:t>What to do</w:t>
+            </w:r>
+          </w:p>
+        </w:tc>
+      </w:tr>
+      <w:tr>
+        <w:trPr>
+          <w:cantSplit/>
+        </w:trPr>
+        <w:tc>
+          <w:tcPr>
+            <w:tcW w:type="dxa" w:w="2381"/>
+            <w:shd w:fill="FFFFFF" w:val="clear"/>
             <w:tcBorders>
               <w:top w:val="single" w:sz="4" w:space="0" w:color="BFBFBF"/>
               <w:left w:val="single" w:sz="4" w:space="0" w:color="BFBFBF"/>
@@ -9820,8 +10522,8 @@
         </w:tc>
         <w:tc>
           <w:tcPr>
-            <w:tcW w:type="dxa" w:w="7314"/>
-            <w:shd w:fill="E9F0F7" w:val="clear"/>
+            <w:tcW w:type="dxa" w:w="3742"/>
+            <w:shd w:fill="FFFFFF" w:val="clear"/>
             <w:tcBorders>
               <w:top w:val="single" w:sz="4" w:space="0" w:color="BFBFBF"/>
               <w:left w:val="single" w:sz="4" w:space="0" w:color="BFBFBF"/>
@@ -9842,7 +10544,35 @@
                 <w:color w:val="2D2D2D"/>
                 <w:sz w:val="19"/>
               </w:rPr>
-              <w:t>Token missing, expired, or wrong client — request a new token</w:t>
+              <w:t>Token missing, expired, or from the wrong client</w:t>
+            </w:r>
+          </w:p>
+        </w:tc>
+        <w:tc>
+          <w:tcPr>
+            <w:tcW w:type="dxa" w:w="3742"/>
+            <w:shd w:fill="FFFFFF" w:val="clear"/>
+            <w:tcBorders>
+              <w:top w:val="single" w:sz="4" w:space="0" w:color="BFBFBF"/>
+              <w:left w:val="single" w:sz="4" w:space="0" w:color="BFBFBF"/>
+              <w:bottom w:val="single" w:sz="4" w:space="0" w:color="BFBFBF"/>
+              <w:right w:val="single" w:sz="4" w:space="0" w:color="BFBFBF"/>
+            </w:tcBorders>
+          </w:tcPr>
+          <w:p>
+            <w:pPr>
+              <w:spacing w:before="40" w:after="40"/>
+            </w:pPr>
+            <w:r/>
+            <w:r>
+              <w:rPr>
+                <w:rFonts w:ascii="Calibri" w:hAnsi="Calibri" w:cs="Calibri" w:eastAsia="Calibri"/>
+                <w:b w:val="0"/>
+                <w:i w:val="0"/>
+                <w:color w:val="2D2D2D"/>
+                <w:sz w:val="19"/>
+              </w:rPr>
+              <w:t>Request a new access token and retry the GET</w:t>
             </w:r>
           </w:p>
         </w:tc>
@@ -9852,21 +10582,6 @@
       <w:pPr>
         <w:spacing w:after="80"/>
       </w:pPr>
-    </w:p>
-    <w:p>
-      <w:pPr>
-        <w:spacing w:before="160" w:after="80" w:line="276" w:lineRule="auto"/>
-      </w:pPr>
-      <w:r>
-        <w:rPr>
-          <w:rFonts w:ascii="Calibri" w:hAnsi="Calibri" w:cs="Calibri" w:eastAsia="Calibri"/>
-          <w:b w:val="0"/>
-          <w:i w:val="0"/>
-          <w:color w:val="2D2D2D"/>
-          <w:sz w:val="22"/>
-        </w:rPr>
-        <w:t>If you need a different date window, change only fromDate and toDate. Keep the YYYY-MM-DD format.</w:t>
-      </w:r>
     </w:p>
     <w:sectPr>
       <w:headerReference w:type="default" r:id="rId9"/>
@@ -9895,7 +10610,7 @@
         <w:color w:val="5B6570"/>
         <w:sz w:val="17"/>
       </w:rPr>
-      <w:t xml:space="preserve">Confidential  ·  For the client test team  ·  v1.0  ·  Page </w:t>
+      <w:t xml:space="preserve">Confidential  ·  For the client test team  ·  v1.1  ·  Page </w:t>
     </w:r>
     <w:r>
       <w:rPr>
@@ -9946,7 +10661,7 @@
         <w:color w:val="1F4E79"/>
         <w:sz w:val="18"/>
       </w:rPr>
-      <w:t>SAT Datashare  ·  exp-sat-datashare-prod-api  ·  Kenya  ·  v1.0 – 25 September 2026</w:t>
+      <w:t>SAT Datashare  ·  exp-sat-datashare-prod-api  ·  Kenya  ·  v1.1 – 25 September 2026</w:t>
     </w:r>
   </w:p>
 </w:hdr>

</xml_diff>